<commit_message>
re-upload of the docx file
</commit_message>
<xml_diff>
--- a/Phase A/Capstone Project - Phase A - 25-1-D-17.docx
+++ b/Phase A/Capstone Project - Phase A - 25-1-D-17.docx
@@ -457,27 +457,7 @@
             <w:sz w:val="32"/>
             <w:szCs w:val="32"/>
           </w:rPr>
-          <w:t>GitHub R</w:t>
-        </w:r>
-        <w:r>
-          <w:rPr>
-            <w:rStyle w:val="Hyperlink"/>
-            <w:rFonts w:cstheme="minorHAnsi"/>
-            <w:b/>
-            <w:sz w:val="32"/>
-            <w:szCs w:val="32"/>
-          </w:rPr>
-          <w:t>e</w:t>
-        </w:r>
-        <w:r>
-          <w:rPr>
-            <w:rStyle w:val="Hyperlink"/>
-            <w:rFonts w:cstheme="minorHAnsi"/>
-            <w:b/>
-            <w:sz w:val="32"/>
-            <w:szCs w:val="32"/>
-          </w:rPr>
-          <w:t>pository</w:t>
+          <w:t>GitHub Repository</w:t>
         </w:r>
       </w:hyperlink>
     </w:p>
@@ -7342,25 +7322,7 @@
           <w:sz w:val="24"/>
           <w:szCs w:val="24"/>
         </w:rPr>
-        <w:t xml:space="preserve">The computational capabilities of OPM enhance its ability to model systems by allowing processes to perform calculations directly within the framework. This is achieved by introducing valued objects, which serve as inputs and outputs for computational processes. These processes can handle tasks ranging from basic arithmetic operations to complex functions implemented through user-defined expressions or programming constructs such as TypeScript. Additionally, OPM supports integration with external computational tools like MATLAB or </w:t>
-      </w:r>
-      <w:proofErr w:type="spellStart"/>
-      <w:r>
-        <w:rPr>
-          <w:rFonts w:asciiTheme="majorBidi" w:hAnsiTheme="majorBidi" w:cstheme="majorBidi"/>
-          <w:sz w:val="24"/>
-          <w:szCs w:val="24"/>
-        </w:rPr>
-        <w:t>Modelica</w:t>
-      </w:r>
-      <w:proofErr w:type="spellEnd"/>
-      <w:r>
-        <w:rPr>
-          <w:rFonts w:asciiTheme="majorBidi" w:hAnsiTheme="majorBidi" w:cstheme="majorBidi"/>
-          <w:sz w:val="24"/>
-          <w:szCs w:val="24"/>
-        </w:rPr>
-        <w:t xml:space="preserve"> for advanced simulations. By combining conceptual and computational modeling, OPM enables dynamic simulations where values are updated in real-time during execution, providing both qualitative and quantitative insights into system behavior. This capability bridges the gap between system and software engineering, allowing seamless integration of physical and informatically elements within a unified model</w:t>
+        <w:t>The computational capabilities of OPM enhance its ability to model systems by allowing processes to perform calculations directly within the framework. This is achieved by introducing valued objects, which serve as inputs and outputs for computational processes. These processes can handle tasks ranging from basic arithmetic operations to complex functions implemented through user-defined expressions or programming constructs such as TypeScript. Additionally, OPM supports integration with external computational tools like MATLAB or Modelica for advanced simulations. By combining conceptual and computational modeling, OPM enables dynamic simulations where values are updated in real-time during execution, providing both qualitative and quantitative insights into system behavior. This capability bridges the gap between system and software engineering, allowing seamless integration of physical and informatically elements within a unified model</w:t>
       </w:r>
       <w:r>
         <w:rPr>
@@ -7606,23 +7568,13 @@
           <w:szCs w:val="24"/>
         </w:rPr>
       </w:pPr>
-      <w:proofErr w:type="gramStart"/>
-      <w:r>
-        <w:rPr>
-          <w:rFonts w:asciiTheme="majorBidi" w:hAnsiTheme="majorBidi" w:cstheme="majorBidi"/>
-          <w:sz w:val="24"/>
-          <w:szCs w:val="24"/>
-        </w:rPr>
-        <w:t>In order to</w:t>
-      </w:r>
-      <w:proofErr w:type="gramEnd"/>
-      <w:r>
-        <w:rPr>
-          <w:rFonts w:asciiTheme="majorBidi" w:hAnsiTheme="majorBidi" w:cstheme="majorBidi"/>
-          <w:sz w:val="24"/>
-          <w:szCs w:val="24"/>
-        </w:rPr>
-        <w:t xml:space="preserve"> proceed with our project, we began by acquiring a comprehensive understanding of Failure to Thrive (FTT), a multifaceted pediatric condition that significantly impacts children’s physical, cognitive, and emotional development. Our research included an in-depth exploration of the underlying causes of FTT, distinguishing between organic factors, such as genetic or physiological conditions, and non-organic factors, such as environmental or psychosocial influences. We further examined the consequences of untreated FTT, which can lead to developmental delays, compromised immune function, and long-term health complications that persist into adulthood. This foundational knowledge allowed us to recognize the critical need for early intervention and comprehensive management strategies.</w:t>
+      <w:r>
+        <w:rPr>
+          <w:rFonts w:asciiTheme="majorBidi" w:hAnsiTheme="majorBidi" w:cstheme="majorBidi"/>
+          <w:sz w:val="24"/>
+          <w:szCs w:val="24"/>
+        </w:rPr>
+        <w:t>In order to proceed with our project, we began by acquiring a comprehensive understanding of Failure to Thrive (FTT), a multifaceted pediatric condition that significantly impacts children’s physical, cognitive, and emotional development. Our research included an in-depth exploration of the underlying causes of FTT, distinguishing between organic factors, such as genetic or physiological conditions, and non-organic factors, such as environmental or psychosocial influences. We further examined the consequences of untreated FTT, which can lead to developmental delays, compromised immune function, and long-term health complications that persist into adulthood. This foundational knowledge allowed us to recognize the critical need for early intervention and comprehensive management strategies.</w:t>
       </w:r>
     </w:p>
     <w:p>
@@ -8289,15 +8241,7 @@
           <w:sz w:val="24"/>
           <w:szCs w:val="24"/>
         </w:rPr>
-        <w:t xml:space="preserve">Dr. Natali Levy </w:t>
-      </w:r>
-      <w:r>
-        <w:rPr>
-          <w:rFonts w:asciiTheme="majorBidi" w:hAnsiTheme="majorBidi" w:cstheme="majorBidi"/>
-          <w:sz w:val="24"/>
-          <w:szCs w:val="24"/>
-        </w:rPr>
-        <w:t xml:space="preserve">and </w:t>
+        <w:t>Dr. Natali Lev</w:t>
       </w:r>
       <w:r>
         <w:rPr>
@@ -8307,9 +8251,8 @@
           <w:sz w:val="24"/>
           <w:szCs w:val="24"/>
         </w:rPr>
-        <w:t xml:space="preserve">Avital </w:t>
-      </w:r>
-      <w:proofErr w:type="spellStart"/>
+        <w:t>i</w:t>
+      </w:r>
       <w:r>
         <w:rPr>
           <w:rFonts w:asciiTheme="majorBidi" w:hAnsiTheme="majorBidi" w:cstheme="majorBidi"/>
@@ -8318,9 +8261,16 @@
           <w:sz w:val="24"/>
           <w:szCs w:val="24"/>
         </w:rPr>
-        <w:t>Shulner</w:t>
-      </w:r>
-      <w:proofErr w:type="spellEnd"/>
+        <w:t xml:space="preserve"> </w:t>
+      </w:r>
+      <w:r>
+        <w:rPr>
+          <w:rFonts w:asciiTheme="majorBidi" w:hAnsiTheme="majorBidi" w:cstheme="majorBidi"/>
+          <w:sz w:val="24"/>
+          <w:szCs w:val="24"/>
+        </w:rPr>
+        <w:t xml:space="preserve">and </w:t>
+      </w:r>
       <w:r>
         <w:rPr>
           <w:rFonts w:asciiTheme="majorBidi" w:hAnsiTheme="majorBidi" w:cstheme="majorBidi"/>
@@ -8329,7 +8279,7 @@
           <w:sz w:val="24"/>
           <w:szCs w:val="24"/>
         </w:rPr>
-        <w:t xml:space="preserve"> Tal</w:t>
+        <w:t>Avital Shulner Tal</w:t>
       </w:r>
       <w:r>
         <w:rPr>
@@ -8403,7 +8353,27 @@
           <w:sz w:val="24"/>
           <w:szCs w:val="24"/>
         </w:rPr>
-        <w:t>Levy:</w:t>
+        <w:t>Lev</w:t>
+      </w:r>
+      <w:r>
+        <w:rPr>
+          <w:rFonts w:asciiTheme="majorBidi" w:hAnsiTheme="majorBidi" w:cstheme="majorBidi"/>
+          <w:b/>
+          <w:bCs/>
+          <w:sz w:val="24"/>
+          <w:szCs w:val="24"/>
+        </w:rPr>
+        <w:t>i</w:t>
+      </w:r>
+      <w:r>
+        <w:rPr>
+          <w:rFonts w:asciiTheme="majorBidi" w:hAnsiTheme="majorBidi" w:cstheme="majorBidi"/>
+          <w:b/>
+          <w:bCs/>
+          <w:sz w:val="24"/>
+          <w:szCs w:val="24"/>
+        </w:rPr>
+        <w:t>:</w:t>
       </w:r>
     </w:p>
     <w:p>
@@ -11245,7 +11215,7 @@
           <w14:ligatures w14:val="standardContextual"/>
         </w:rPr>
         <w:drawing>
-          <wp:anchor distT="0" distB="0" distL="114300" distR="114300" simplePos="0" relativeHeight="251658240" behindDoc="0" locked="0" layoutInCell="1" allowOverlap="1" wp14:anchorId="1722B5EF" wp14:editId="4A42E033">
+          <wp:anchor distT="0" distB="0" distL="114300" distR="114300" simplePos="0" relativeHeight="251658240" behindDoc="0" locked="0" layoutInCell="1" allowOverlap="1" wp14:anchorId="1722B5EF" wp14:editId="37A698C6">
             <wp:simplePos x="0" y="0"/>
             <wp:positionH relativeFrom="margin">
               <wp:posOffset>83820</wp:posOffset>
@@ -13594,7 +13564,7 @@
           <w14:ligatures w14:val="standardContextual"/>
         </w:rPr>
         <w:drawing>
-          <wp:inline distT="0" distB="0" distL="0" distR="0" wp14:anchorId="5CDDE807" wp14:editId="3A4027C7">
+          <wp:inline distT="0" distB="0" distL="0" distR="0" wp14:anchorId="5CDDE807" wp14:editId="66070DBA">
             <wp:extent cx="5274310" cy="2708910"/>
             <wp:effectExtent l="0" t="0" r="2540" b="0"/>
             <wp:docPr id="1331823331" name="תמונה 9" descr="תמונה שמכילה טקסט, תרשים, קו, עיגול&#10;&#10;התיאור נוצר באופן אוטומטי"/>
@@ -14363,25 +14333,7 @@
           <w:sz w:val="24"/>
           <w:szCs w:val="24"/>
         </w:rPr>
-        <w:t xml:space="preserve">The system will automatically log out inactive users after a set </w:t>
-      </w:r>
-      <w:proofErr w:type="gramStart"/>
-      <w:r>
-        <w:rPr>
-          <w:rFonts w:asciiTheme="majorBidi" w:hAnsiTheme="majorBidi" w:cstheme="majorBidi"/>
-          <w:sz w:val="24"/>
-          <w:szCs w:val="24"/>
-        </w:rPr>
-        <w:t>period of time</w:t>
-      </w:r>
-      <w:proofErr w:type="gramEnd"/>
-      <w:r>
-        <w:rPr>
-          <w:rFonts w:asciiTheme="majorBidi" w:hAnsiTheme="majorBidi" w:cstheme="majorBidi"/>
-          <w:sz w:val="24"/>
-          <w:szCs w:val="24"/>
-        </w:rPr>
-        <w:t>.</w:t>
+        <w:t>The system will automatically log out inactive users after a set period of time.</w:t>
       </w:r>
     </w:p>
     <w:p>
@@ -20151,25 +20103,7 @@
           <w:sz w:val="24"/>
           <w:szCs w:val="24"/>
         </w:rPr>
-        <w:t xml:space="preserve">Levi-Soskin, N., </w:t>
-      </w:r>
-      <w:proofErr w:type="spellStart"/>
-      <w:r>
-        <w:rPr>
-          <w:rFonts w:asciiTheme="majorBidi" w:hAnsiTheme="majorBidi" w:cstheme="majorBidi"/>
-          <w:sz w:val="24"/>
-          <w:szCs w:val="24"/>
-        </w:rPr>
-        <w:t>Shaoul</w:t>
-      </w:r>
-      <w:proofErr w:type="spellEnd"/>
-      <w:r>
-        <w:rPr>
-          <w:rFonts w:asciiTheme="majorBidi" w:hAnsiTheme="majorBidi" w:cstheme="majorBidi"/>
-          <w:sz w:val="24"/>
-          <w:szCs w:val="24"/>
-        </w:rPr>
-        <w:t>, R., Kohen, H., Jbara, A., &amp; Dori, D. (2019). Model-based diagnosis with FTTell: Assessing the potential for pediatric failure to thrive (FTT) during the perinatal stage. In </w:t>
+        <w:t>Levi-Soskin, N., Shaoul, R., Kohen, H., Jbara, A., &amp; Dori, D. (2019). Model-based diagnosis with FTTell: Assessing the potential for pediatric failure to thrive (FTT) during the perinatal stage. In </w:t>
       </w:r>
       <w:r>
         <w:rPr>
@@ -20179,29 +20113,7 @@
           <w:sz w:val="24"/>
           <w:szCs w:val="24"/>
         </w:rPr>
-        <w:t xml:space="preserve">Information Systems: Research, Development, Applications, Education: 12th SIGSAND/PLAIS </w:t>
-      </w:r>
-      <w:proofErr w:type="spellStart"/>
-      <w:r>
-        <w:rPr>
-          <w:rFonts w:asciiTheme="majorBidi" w:hAnsiTheme="majorBidi" w:cstheme="majorBidi"/>
-          <w:i/>
-          <w:iCs/>
-          <w:sz w:val="24"/>
-          <w:szCs w:val="24"/>
-        </w:rPr>
-        <w:t>EuroSymposium</w:t>
-      </w:r>
-      <w:proofErr w:type="spellEnd"/>
-      <w:r>
-        <w:rPr>
-          <w:rFonts w:asciiTheme="majorBidi" w:hAnsiTheme="majorBidi" w:cstheme="majorBidi"/>
-          <w:i/>
-          <w:iCs/>
-          <w:sz w:val="24"/>
-          <w:szCs w:val="24"/>
-        </w:rPr>
-        <w:t xml:space="preserve"> 2019, Gdansk, Poland, September 19, 2019, Proceedings</w:t>
+        <w:t>Information Systems: Research, Development, Applications, Education: 12th SIGSAND/PLAIS EuroSymposium 2019, Gdansk, Poland, September 19, 2019, Proceedings</w:t>
       </w:r>
       <w:bookmarkEnd w:id="21"/>
       <w:r>
@@ -20308,25 +20220,7 @@
           <w:sz w:val="24"/>
           <w:szCs w:val="24"/>
         </w:rPr>
-        <w:t xml:space="preserve">Mehta, N. M., Corkins, M. R., Lyman, B., Malone, A., </w:t>
-      </w:r>
-      <w:proofErr w:type="spellStart"/>
-      <w:r>
-        <w:rPr>
-          <w:rFonts w:asciiTheme="majorBidi" w:hAnsiTheme="majorBidi" w:cstheme="majorBidi"/>
-          <w:sz w:val="24"/>
-          <w:szCs w:val="24"/>
-        </w:rPr>
-        <w:t>Goday</w:t>
-      </w:r>
-      <w:proofErr w:type="spellEnd"/>
-      <w:r>
-        <w:rPr>
-          <w:rFonts w:asciiTheme="majorBidi" w:hAnsiTheme="majorBidi" w:cstheme="majorBidi"/>
-          <w:sz w:val="24"/>
-          <w:szCs w:val="24"/>
-        </w:rPr>
-        <w:t>, P. S., Carney, L., ... &amp; American Society for Parenteral and Enteral Nutrition (ASPEN) Board of Directors. (2013). Defining pediatric malnutrition: a paradigm shift toward etiology‐related definitions. </w:t>
+        <w:t>Mehta, N. M., Corkins, M. R., Lyman, B., Malone, A., Goday, P. S., Carney, L., ... &amp; American Society for Parenteral and Enteral Nutrition (ASPEN) Board of Directors. (2013). Defining pediatric malnutrition: a paradigm shift toward etiology‐related definitions. </w:t>
       </w:r>
       <w:r>
         <w:rPr>
@@ -20388,25 +20282,7 @@
           <w:sz w:val="24"/>
           <w:szCs w:val="24"/>
         </w:rPr>
-        <w:t xml:space="preserve">Fox, J., Johns, N., &amp; Rahmanzadeh, A. (1998). Disseminating medical knowledge: the </w:t>
-      </w:r>
-      <w:proofErr w:type="spellStart"/>
-      <w:r>
-        <w:rPr>
-          <w:rFonts w:asciiTheme="majorBidi" w:hAnsiTheme="majorBidi" w:cstheme="majorBidi"/>
-          <w:sz w:val="24"/>
-          <w:szCs w:val="24"/>
-        </w:rPr>
-        <w:t>PROforma</w:t>
-      </w:r>
-      <w:proofErr w:type="spellEnd"/>
-      <w:r>
-        <w:rPr>
-          <w:rFonts w:asciiTheme="majorBidi" w:hAnsiTheme="majorBidi" w:cstheme="majorBidi"/>
-          <w:sz w:val="24"/>
-          <w:szCs w:val="24"/>
-        </w:rPr>
-        <w:t xml:space="preserve"> approach. </w:t>
+        <w:t>Fox, J., Johns, N., &amp; Rahmanzadeh, A. (1998). Disseminating medical knowledge: the PROforma approach. </w:t>
       </w:r>
       <w:r>
         <w:rPr>
@@ -20477,25 +20353,7 @@
           <w:sz w:val="24"/>
           <w:szCs w:val="24"/>
         </w:rPr>
-        <w:t xml:space="preserve">Guo, C., Fu, Z., Zhang, Z., Ren, S., &amp; Sha, L. (2018). Design verifiably correct model patterns to facilitate modeling medical best practice guidelines with </w:t>
-      </w:r>
-      <w:proofErr w:type="spellStart"/>
-      <w:r>
-        <w:rPr>
-          <w:rFonts w:asciiTheme="majorBidi" w:hAnsiTheme="majorBidi" w:cstheme="majorBidi"/>
-          <w:sz w:val="24"/>
-          <w:szCs w:val="24"/>
-        </w:rPr>
-        <w:t>statecharts</w:t>
-      </w:r>
-      <w:proofErr w:type="spellEnd"/>
-      <w:r>
-        <w:rPr>
-          <w:rFonts w:asciiTheme="majorBidi" w:hAnsiTheme="majorBidi" w:cstheme="majorBidi"/>
-          <w:sz w:val="24"/>
-          <w:szCs w:val="24"/>
-        </w:rPr>
-        <w:t>. </w:t>
+        <w:t>Guo, C., Fu, Z., Zhang, Z., Ren, S., &amp; Sha, L. (2018). Design verifiably correct model patterns to facilitate modeling medical best practice guidelines with statecharts. </w:t>
       </w:r>
       <w:r>
         <w:rPr>
@@ -20566,25 +20424,7 @@
           <w:sz w:val="24"/>
           <w:szCs w:val="24"/>
         </w:rPr>
-        <w:t xml:space="preserve">Guo, C., Ren, S., Jiang, Y., Wu, P. L., Sha, L., &amp; Berlin, R. B. (2016, April). Transforming medical best practice guidelines to executable and verifiable </w:t>
-      </w:r>
-      <w:proofErr w:type="spellStart"/>
-      <w:r>
-        <w:rPr>
-          <w:rFonts w:asciiTheme="majorBidi" w:hAnsiTheme="majorBidi" w:cstheme="majorBidi"/>
-          <w:sz w:val="24"/>
-          <w:szCs w:val="24"/>
-        </w:rPr>
-        <w:t>statechart</w:t>
-      </w:r>
-      <w:proofErr w:type="spellEnd"/>
-      <w:r>
-        <w:rPr>
-          <w:rFonts w:asciiTheme="majorBidi" w:hAnsiTheme="majorBidi" w:cstheme="majorBidi"/>
-          <w:sz w:val="24"/>
-          <w:szCs w:val="24"/>
-        </w:rPr>
-        <w:t xml:space="preserve"> models. In </w:t>
+        <w:t>Guo, C., Ren, S., Jiang, Y., Wu, P. L., Sha, L., &amp; Berlin, R. B. (2016, April). Transforming medical best practice guidelines to executable and verifiable statechart models. In </w:t>
       </w:r>
       <w:r>
         <w:rPr>
@@ -20638,25 +20478,7 @@
           <w:szCs w:val="24"/>
         </w:rPr>
         <w:lastRenderedPageBreak/>
-        <w:t xml:space="preserve">Izhar, M., Naqvi, S. A. A., Ahmed, A., Abdullah, S., </w:t>
-      </w:r>
-      <w:proofErr w:type="spellStart"/>
-      <w:r>
-        <w:rPr>
-          <w:rFonts w:asciiTheme="majorBidi" w:hAnsiTheme="majorBidi" w:cstheme="majorBidi"/>
-          <w:sz w:val="24"/>
-          <w:szCs w:val="24"/>
-        </w:rPr>
-        <w:t>Alturki</w:t>
-      </w:r>
-      <w:proofErr w:type="spellEnd"/>
-      <w:r>
-        <w:rPr>
-          <w:rFonts w:asciiTheme="majorBidi" w:hAnsiTheme="majorBidi" w:cstheme="majorBidi"/>
-          <w:sz w:val="24"/>
-          <w:szCs w:val="24"/>
-        </w:rPr>
-        <w:t>, N., &amp; Jamel, L. (2023). Enhancing Healthcare Efficacy Through IoT-Edge Fusion: A Novel Approach for Smart Health Monitoring and Diagnosis. </w:t>
+        <w:t>Izhar, M., Naqvi, S. A. A., Ahmed, A., Abdullah, S., Alturki, N., &amp; Jamel, L. (2023). Enhancing Healthcare Efficacy Through IoT-Edge Fusion: A Novel Approach for Smart Health Monitoring and Diagnosis. </w:t>
       </w:r>
       <w:r>
         <w:rPr>
@@ -20721,59 +20543,13 @@
         </w:rPr>
       </w:pPr>
       <w:bookmarkStart w:id="28" w:name="_Ref190094712"/>
-      <w:proofErr w:type="spellStart"/>
-      <w:r>
-        <w:rPr>
-          <w:rFonts w:asciiTheme="majorBidi" w:hAnsiTheme="majorBidi" w:cstheme="majorBidi"/>
-          <w:sz w:val="24"/>
-          <w:szCs w:val="24"/>
-        </w:rPr>
-        <w:t>Iyenghar</w:t>
-      </w:r>
-      <w:proofErr w:type="spellEnd"/>
-      <w:r>
-        <w:rPr>
-          <w:rFonts w:asciiTheme="majorBidi" w:hAnsiTheme="majorBidi" w:cstheme="majorBidi"/>
-          <w:sz w:val="24"/>
-          <w:szCs w:val="24"/>
-        </w:rPr>
-        <w:t xml:space="preserve">, P., </w:t>
-      </w:r>
-      <w:proofErr w:type="spellStart"/>
-      <w:r>
-        <w:rPr>
-          <w:rFonts w:asciiTheme="majorBidi" w:hAnsiTheme="majorBidi" w:cstheme="majorBidi"/>
-          <w:sz w:val="24"/>
-          <w:szCs w:val="24"/>
-        </w:rPr>
-        <w:t>Gracic</w:t>
-      </w:r>
-      <w:proofErr w:type="spellEnd"/>
-      <w:r>
-        <w:rPr>
-          <w:rFonts w:asciiTheme="majorBidi" w:hAnsiTheme="majorBidi" w:cstheme="majorBidi"/>
-          <w:sz w:val="24"/>
-          <w:szCs w:val="24"/>
-        </w:rPr>
-        <w:t xml:space="preserve">, E., &amp; </w:t>
-      </w:r>
-      <w:proofErr w:type="spellStart"/>
-      <w:r>
-        <w:rPr>
-          <w:rFonts w:asciiTheme="majorBidi" w:hAnsiTheme="majorBidi" w:cstheme="majorBidi"/>
-          <w:sz w:val="24"/>
-          <w:szCs w:val="24"/>
-        </w:rPr>
-        <w:t>Pawelke</w:t>
-      </w:r>
-      <w:proofErr w:type="spellEnd"/>
-      <w:r>
-        <w:rPr>
-          <w:rFonts w:asciiTheme="majorBidi" w:hAnsiTheme="majorBidi" w:cstheme="majorBidi"/>
-          <w:sz w:val="24"/>
-          <w:szCs w:val="24"/>
-        </w:rPr>
-        <w:t>, G. (2024). A Systematic Approach to Enhancing ISO 26262 with Machine Learning-Specific Life Cycle Phases and Testing Methods. </w:t>
+      <w:r>
+        <w:rPr>
+          <w:rFonts w:asciiTheme="majorBidi" w:hAnsiTheme="majorBidi" w:cstheme="majorBidi"/>
+          <w:sz w:val="24"/>
+          <w:szCs w:val="24"/>
+        </w:rPr>
+        <w:t>Iyenghar, P., Gracic, E., &amp; Pawelke, G. (2024). A Systematic Approach to Enhancing ISO 26262 with Machine Learning-Specific Life Cycle Phases and Testing Methods. </w:t>
       </w:r>
       <w:r>
         <w:rPr>
@@ -20905,29 +20681,7 @@
           <w:sz w:val="24"/>
           <w:szCs w:val="24"/>
         </w:rPr>
-        <w:t xml:space="preserve">Guidelines on physical activity, sedentary </w:t>
-      </w:r>
-      <w:proofErr w:type="spellStart"/>
-      <w:r>
-        <w:rPr>
-          <w:rFonts w:asciiTheme="majorBidi" w:hAnsiTheme="majorBidi" w:cstheme="majorBidi"/>
-          <w:i/>
-          <w:iCs/>
-          <w:sz w:val="24"/>
-          <w:szCs w:val="24"/>
-        </w:rPr>
-        <w:t>behaviour</w:t>
-      </w:r>
-      <w:proofErr w:type="spellEnd"/>
-      <w:r>
-        <w:rPr>
-          <w:rFonts w:asciiTheme="majorBidi" w:hAnsiTheme="majorBidi" w:cstheme="majorBidi"/>
-          <w:i/>
-          <w:iCs/>
-          <w:sz w:val="24"/>
-          <w:szCs w:val="24"/>
-        </w:rPr>
-        <w:t xml:space="preserve"> and sleep for children under 5 years of age</w:t>
+        <w:t>Guidelines on physical activity, sedentary behaviour and sleep for children under 5 years of age</w:t>
       </w:r>
       <w:r>
         <w:rPr>
@@ -20962,43 +20716,14 @@
           <w:szCs w:val="24"/>
         </w:rPr>
       </w:pPr>
-      <w:proofErr w:type="spellStart"/>
       <w:r>
         <w:rPr>
           <w:rFonts w:asciiTheme="majorBidi" w:eastAsia="David" w:hAnsiTheme="majorBidi" w:cstheme="majorBidi"/>
           <w:sz w:val="24"/>
           <w:szCs w:val="24"/>
         </w:rPr>
-        <w:t>Lipnowski</w:t>
-      </w:r>
-      <w:proofErr w:type="spellEnd"/>
-      <w:r>
-        <w:rPr>
-          <w:rFonts w:asciiTheme="majorBidi" w:eastAsia="David" w:hAnsiTheme="majorBidi" w:cstheme="majorBidi"/>
-          <w:sz w:val="24"/>
-          <w:szCs w:val="24"/>
-        </w:rPr>
-        <w:t xml:space="preserve">, S., LeBlanc, C. M., Canadian </w:t>
-      </w:r>
-      <w:proofErr w:type="spellStart"/>
-      <w:r>
-        <w:rPr>
-          <w:rFonts w:asciiTheme="majorBidi" w:eastAsia="David" w:hAnsiTheme="majorBidi" w:cstheme="majorBidi"/>
-          <w:sz w:val="24"/>
-          <w:szCs w:val="24"/>
-        </w:rPr>
-        <w:t>Paediatric</w:t>
-      </w:r>
-      <w:proofErr w:type="spellEnd"/>
-      <w:r>
-        <w:rPr>
-          <w:rFonts w:asciiTheme="majorBidi" w:eastAsia="David" w:hAnsiTheme="majorBidi" w:cstheme="majorBidi"/>
-          <w:sz w:val="24"/>
-          <w:szCs w:val="24"/>
-        </w:rPr>
-        <w:t xml:space="preserve"> Society, &amp; Healthy Active Living and Sports Medicine Committee. (2012). Healthy active living: Physical activity guidelines for children and adolescents. </w:t>
-      </w:r>
-      <w:proofErr w:type="spellStart"/>
+        <w:t>Lipnowski, S., LeBlanc, C. M., Canadian Paediatric Society, &amp; Healthy Active Living and Sports Medicine Committee. (2012). Healthy active living: Physical activity guidelines for children and adolescents. </w:t>
+      </w:r>
       <w:r>
         <w:rPr>
           <w:rFonts w:asciiTheme="majorBidi" w:eastAsia="David" w:hAnsiTheme="majorBidi" w:cstheme="majorBidi"/>
@@ -21007,18 +20732,7 @@
           <w:sz w:val="24"/>
           <w:szCs w:val="24"/>
         </w:rPr>
-        <w:t>Paediatrics</w:t>
-      </w:r>
-      <w:proofErr w:type="spellEnd"/>
-      <w:r>
-        <w:rPr>
-          <w:rFonts w:asciiTheme="majorBidi" w:eastAsia="David" w:hAnsiTheme="majorBidi" w:cstheme="majorBidi"/>
-          <w:i/>
-          <w:iCs/>
-          <w:sz w:val="24"/>
-          <w:szCs w:val="24"/>
-        </w:rPr>
-        <w:t xml:space="preserve"> &amp; child health</w:t>
+        <w:t>Paediatrics &amp; child health</w:t>
       </w:r>
       <w:r>
         <w:rPr>
@@ -21077,25 +20791,7 @@
           <w:sz w:val="24"/>
           <w:szCs w:val="24"/>
         </w:rPr>
-        <w:t xml:space="preserve">Chouraqui, J. P., Thornton, S. N., </w:t>
-      </w:r>
-      <w:proofErr w:type="spellStart"/>
-      <w:r>
-        <w:rPr>
-          <w:rFonts w:asciiTheme="majorBidi" w:hAnsiTheme="majorBidi" w:cstheme="majorBidi"/>
-          <w:sz w:val="24"/>
-          <w:szCs w:val="24"/>
-        </w:rPr>
-        <w:t>Seconda</w:t>
-      </w:r>
-      <w:proofErr w:type="spellEnd"/>
-      <w:r>
-        <w:rPr>
-          <w:rFonts w:asciiTheme="majorBidi" w:hAnsiTheme="majorBidi" w:cstheme="majorBidi"/>
-          <w:sz w:val="24"/>
-          <w:szCs w:val="24"/>
-        </w:rPr>
-        <w:t>, L., &amp; Kavouras, S. A. (2022). Total water intake and its contributors in infants and young children. </w:t>
+        <w:t>Chouraqui, J. P., Thornton, S. N., Seconda, L., &amp; Kavouras, S. A. (2022). Total water intake and its contributors in infants and young children. </w:t>
       </w:r>
       <w:r>
         <w:rPr>
@@ -21249,20 +20945,9 @@
             <w:sz w:val="24"/>
             <w:szCs w:val="24"/>
           </w:rPr>
-          <w:t>2to20years:Girls Stature Weight-for-</w:t>
-        </w:r>
-        <w:proofErr w:type="spellStart"/>
-        <w:r>
-          <w:rPr>
-            <w:rStyle w:val="Hyperlink"/>
-            <w:rFonts w:asciiTheme="majorBidi" w:hAnsiTheme="majorBidi" w:cstheme="majorBidi"/>
-            <w:sz w:val="24"/>
-            <w:szCs w:val="24"/>
-          </w:rPr>
-          <w:t>agepercentiles</w:t>
+          <w:t>2to20years:Girls Stature Weight-for-agepercentiles</w:t>
         </w:r>
         <w:bookmarkEnd w:id="31"/>
-        <w:proofErr w:type="spellEnd"/>
       </w:hyperlink>
     </w:p>
     <w:p>
@@ -21325,43 +21010,7 @@
           <w:sz w:val="24"/>
           <w:szCs w:val="24"/>
         </w:rPr>
-        <w:t xml:space="preserve">Martini, L., Pecoraro, L., </w:t>
-      </w:r>
-      <w:proofErr w:type="spellStart"/>
-      <w:r>
-        <w:rPr>
-          <w:rFonts w:asciiTheme="majorBidi" w:hAnsiTheme="majorBidi" w:cstheme="majorBidi"/>
-          <w:sz w:val="24"/>
-          <w:szCs w:val="24"/>
-        </w:rPr>
-        <w:t>Salvottini</w:t>
-      </w:r>
-      <w:proofErr w:type="spellEnd"/>
-      <w:r>
-        <w:rPr>
-          <w:rFonts w:asciiTheme="majorBidi" w:hAnsiTheme="majorBidi" w:cstheme="majorBidi"/>
-          <w:sz w:val="24"/>
-          <w:szCs w:val="24"/>
-        </w:rPr>
-        <w:t xml:space="preserve">, C., Piacentini, G., Atkinson, R., &amp; </w:t>
-      </w:r>
-      <w:proofErr w:type="spellStart"/>
-      <w:r>
-        <w:rPr>
-          <w:rFonts w:asciiTheme="majorBidi" w:hAnsiTheme="majorBidi" w:cstheme="majorBidi"/>
-          <w:sz w:val="24"/>
-          <w:szCs w:val="24"/>
-        </w:rPr>
-        <w:t>Pietrobelli</w:t>
-      </w:r>
-      <w:proofErr w:type="spellEnd"/>
-      <w:r>
-        <w:rPr>
-          <w:rFonts w:asciiTheme="majorBidi" w:hAnsiTheme="majorBidi" w:cstheme="majorBidi"/>
-          <w:sz w:val="24"/>
-          <w:szCs w:val="24"/>
-        </w:rPr>
-        <w:t>, A. (2020). Appropriate and inappropriate vitamin supplementation in children. </w:t>
+        <w:t>Martini, L., Pecoraro, L., Salvottini, C., Piacentini, G., Atkinson, R., &amp; Pietrobelli, A. (2020). Appropriate and inappropriate vitamin supplementation in children. </w:t>
       </w:r>
       <w:r>
         <w:rPr>
@@ -21515,29 +21164,7 @@
           <w:sz w:val="24"/>
           <w:szCs w:val="24"/>
         </w:rPr>
-        <w:t xml:space="preserve">Guidelines on physical activity, sedentary </w:t>
-      </w:r>
-      <w:proofErr w:type="spellStart"/>
-      <w:r>
-        <w:rPr>
-          <w:rFonts w:asciiTheme="majorBidi" w:hAnsiTheme="majorBidi" w:cstheme="majorBidi"/>
-          <w:i/>
-          <w:iCs/>
-          <w:sz w:val="24"/>
-          <w:szCs w:val="24"/>
-        </w:rPr>
-        <w:t>behaviour</w:t>
-      </w:r>
-      <w:proofErr w:type="spellEnd"/>
-      <w:r>
-        <w:rPr>
-          <w:rFonts w:asciiTheme="majorBidi" w:hAnsiTheme="majorBidi" w:cstheme="majorBidi"/>
-          <w:i/>
-          <w:iCs/>
-          <w:sz w:val="24"/>
-          <w:szCs w:val="24"/>
-        </w:rPr>
-        <w:t xml:space="preserve"> and sleep for children under 5 years of age</w:t>
+        <w:t>Guidelines on physical activity, sedentary behaviour and sleep for children under 5 years of age</w:t>
       </w:r>
       <w:r>
         <w:rPr>
@@ -21580,25 +21207,7 @@
           <w:sz w:val="24"/>
           <w:szCs w:val="24"/>
         </w:rPr>
-        <w:t xml:space="preserve">Chouraqui, J. P., Thornton, S. N., </w:t>
-      </w:r>
-      <w:proofErr w:type="spellStart"/>
-      <w:r>
-        <w:rPr>
-          <w:rFonts w:asciiTheme="majorBidi" w:hAnsiTheme="majorBidi" w:cstheme="majorBidi"/>
-          <w:sz w:val="24"/>
-          <w:szCs w:val="24"/>
-        </w:rPr>
-        <w:t>Seconda</w:t>
-      </w:r>
-      <w:proofErr w:type="spellEnd"/>
-      <w:r>
-        <w:rPr>
-          <w:rFonts w:asciiTheme="majorBidi" w:hAnsiTheme="majorBidi" w:cstheme="majorBidi"/>
-          <w:sz w:val="24"/>
-          <w:szCs w:val="24"/>
-        </w:rPr>
-        <w:t>, L., &amp; Kavouras, S. A. (2022). Total water intake and its contributors in infants and young children. </w:t>
+        <w:t>Chouraqui, J. P., Thornton, S. N., Seconda, L., &amp; Kavouras, S. A. (2022). Total water intake and its contributors in infants and young children. </w:t>
       </w:r>
       <w:r>
         <w:rPr>
@@ -21660,25 +21269,7 @@
           <w:sz w:val="24"/>
           <w:szCs w:val="24"/>
         </w:rPr>
-        <w:t xml:space="preserve">Levi‐Soskin, N., </w:t>
-      </w:r>
-      <w:proofErr w:type="spellStart"/>
-      <w:r>
-        <w:rPr>
-          <w:rFonts w:asciiTheme="majorBidi" w:hAnsiTheme="majorBidi" w:cstheme="majorBidi"/>
-          <w:sz w:val="24"/>
-          <w:szCs w:val="24"/>
-        </w:rPr>
-        <w:t>Marwedel</w:t>
-      </w:r>
-      <w:proofErr w:type="spellEnd"/>
-      <w:r>
-        <w:rPr>
-          <w:rFonts w:asciiTheme="majorBidi" w:hAnsiTheme="majorBidi" w:cstheme="majorBidi"/>
-          <w:sz w:val="24"/>
-          <w:szCs w:val="24"/>
-        </w:rPr>
-        <w:t>, S., Jbara, A., &amp; Dori, D. (2024). Enhancing conceptual models with computational capabilities: A methodical approach to executable integrative modeling. </w:t>
+        <w:t>Levi‐Soskin, N., Marwedel, S., Jbara, A., &amp; Dori, D. (2024). Enhancing conceptual models with computational capabilities: A methodical approach to executable integrative modeling. </w:t>
       </w:r>
       <w:r>
         <w:rPr>

</xml_diff>